<commit_message>
++++ML_VIDEO++++:KKN for regression and its formula, example code for diabetes prediction on project folder(code has overfitting model)
</commit_message>
<xml_diff>
--- a/machine_learning_basics/KNN.docx
+++ b/machine_learning_basics/KNN.docx
@@ -1,6 +1,6 @@
 
 <file path=word/document.xml><?xml version="1.0" encoding="utf-8"?>
-<w:document xmlns:wpc="http://schemas.microsoft.com/office/word/2010/wordprocessingCanvas" xmlns:cx="http://schemas.microsoft.com/office/drawing/2014/chartex" xmlns:cx1="http://schemas.microsoft.com/office/drawing/2015/9/8/chartex" xmlns:cx2="http://schemas.microsoft.com/office/drawing/2015/10/21/chartex" xmlns:cx3="http://schemas.microsoft.com/office/drawing/2016/5/9/chartex" xmlns:cx4="http://schemas.microsoft.com/office/drawing/2016/5/10/chartex" xmlns:cx5="http://schemas.microsoft.com/office/drawing/2016/5/11/chartex" xmlns:cx6="http://schemas.microsoft.com/office/drawing/2016/5/12/chartex" xmlns:cx7="http://schemas.microsoft.com/office/drawing/2016/5/13/chartex" xmlns:cx8="http://schemas.microsoft.com/office/drawing/2016/5/14/chartex" xmlns:mc="http://schemas.openxmlformats.org/markup-compatibility/2006" xmlns:aink="http://schemas.microsoft.com/office/drawing/2016/ink" xmlns:am3d="http://schemas.microsoft.com/office/drawing/2017/model3d" xmlns:o="urn:schemas-microsoft-com:office:office" xmlns:oel="http://schemas.microsoft.com/office/2019/extlst" xmlns:r="http://schemas.openxmlformats.org/officeDocument/2006/relationships" xmlns:m="http://schemas.openxmlformats.org/officeDocument/2006/math" xmlns:v="urn:schemas-microsoft-com:vml" xmlns:wp14="http://schemas.microsoft.com/office/word/2010/wordprocessingDrawing" xmlns:wp="http://schemas.openxmlformats.org/drawingml/2006/wordprocessingDrawing" xmlns:w10="urn:schemas-microsoft-com:office:word" xmlns:w="http://schemas.openxmlformats.org/wordprocessingml/2006/main" xmlns:w14="http://schemas.microsoft.com/office/word/2010/wordml" xmlns:w15="http://schemas.microsoft.com/office/word/2012/wordml" xmlns:w16cex="http://schemas.microsoft.com/office/word/2018/wordml/cex" xmlns:w16cid="http://schemas.microsoft.com/office/word/2016/wordml/cid" xmlns:w16="http://schemas.microsoft.com/office/word/2018/wordml" xmlns:w16du="http://schemas.microsoft.com/office/word/2023/wordml/word16du" xmlns:w16sdtdh="http://schemas.microsoft.com/office/word/2020/wordml/sdtdatahash" xmlns:w16se="http://schemas.microsoft.com/office/word/2015/wordml/symex" xmlns:wpg="http://schemas.microsoft.com/office/word/2010/wordprocessingGroup" xmlns:wpi="http://schemas.microsoft.com/office/word/2010/wordprocessingInk" xmlns:wne="http://schemas.microsoft.com/office/word/2006/wordml" xmlns:wps="http://schemas.microsoft.com/office/word/2010/wordprocessingShape" mc:Ignorable="w14 w15 w16se w16cid w16 w16cex w16sdtdh w16du wp14">
+<w:document xmlns:wpc="http://schemas.microsoft.com/office/word/2010/wordprocessingCanvas" xmlns:cx="http://schemas.microsoft.com/office/drawing/2014/chartex" xmlns:cx1="http://schemas.microsoft.com/office/drawing/2015/9/8/chartex" xmlns:cx2="http://schemas.microsoft.com/office/drawing/2015/10/21/chartex" xmlns:cx3="http://schemas.microsoft.com/office/drawing/2016/5/9/chartex" xmlns:cx4="http://schemas.microsoft.com/office/drawing/2016/5/10/chartex" xmlns:cx5="http://schemas.microsoft.com/office/drawing/2016/5/11/chartex" xmlns:cx6="http://schemas.microsoft.com/office/drawing/2016/5/12/chartex" xmlns:cx7="http://schemas.microsoft.com/office/drawing/2016/5/13/chartex" xmlns:cx8="http://schemas.microsoft.com/office/drawing/2016/5/14/chartex" xmlns:mc="http://schemas.openxmlformats.org/markup-compatibility/2006" xmlns:aink="http://schemas.microsoft.com/office/drawing/2016/ink" xmlns:am3d="http://schemas.microsoft.com/office/drawing/2017/model3d" xmlns:o="urn:schemas-microsoft-com:office:office" xmlns:oel="http://schemas.microsoft.com/office/2019/extlst" xmlns:r="http://schemas.openxmlformats.org/officeDocument/2006/relationships" xmlns:m="http://schemas.openxmlformats.org/officeDocument/2006/math" xmlns:v="urn:schemas-microsoft-com:vml" xmlns:wp14="http://schemas.microsoft.com/office/word/2010/wordprocessingDrawing" xmlns:wp="http://schemas.openxmlformats.org/drawingml/2006/wordprocessingDrawing" xmlns:w10="urn:schemas-microsoft-com:office:word" xmlns:w="http://schemas.openxmlformats.org/wordprocessingml/2006/main" xmlns:w14="http://schemas.microsoft.com/office/word/2010/wordml" xmlns:w15="http://schemas.microsoft.com/office/word/2012/wordml" xmlns:w16cex="http://schemas.microsoft.com/office/word/2018/wordml/cex" xmlns:w16cid="http://schemas.microsoft.com/office/word/2016/wordml/cid" xmlns:w16="http://schemas.microsoft.com/office/word/2018/wordml" xmlns:w16du="http://schemas.microsoft.com/office/word/2023/wordml/word16du" xmlns:w16sdtdh="http://schemas.microsoft.com/office/word/2020/wordml/sdtdatahash" xmlns:w16sdtfl="http://schemas.microsoft.com/office/word/2024/wordml/sdtformatlock" xmlns:w16se="http://schemas.microsoft.com/office/word/2015/wordml/symex" xmlns:wpg="http://schemas.microsoft.com/office/word/2010/wordprocessingGroup" xmlns:wpi="http://schemas.microsoft.com/office/word/2010/wordprocessingInk" xmlns:wne="http://schemas.microsoft.com/office/word/2006/wordml" xmlns:wps="http://schemas.microsoft.com/office/word/2010/wordprocessingShape" mc:Ignorable="w14 w15 w16se w16cid w16 w16cex w16sdtdh w16sdtfl w16du wp14">
   <w:body>
     <w:p>
       <w:r>
@@ -46,6 +46,9 @@
     </w:p>
     <w:p>
       <w:r>
+        <w:rPr>
+          <w:noProof/>
+        </w:rPr>
         <w:drawing>
           <wp:inline distT="0" distB="0" distL="0" distR="0" wp14:anchorId="2908707B" wp14:editId="04968252">
             <wp:extent cx="5731510" cy="3100705"/>
@@ -83,6 +86,408 @@
         </w:drawing>
       </w:r>
     </w:p>
+    <w:p>
+      <w:r>
+        <w:t>In the below example</w:t>
+      </w:r>
+      <w:r>
+        <w:t xml:space="preserve"> we choose the k value as 3 so we have to find top 3 nearest data points from the new data point</w:t>
+      </w:r>
+    </w:p>
+    <w:p>
+      <w:r>
+        <w:lastRenderedPageBreak/>
+        <w:drawing>
+          <wp:inline distT="0" distB="0" distL="0" distR="0" wp14:anchorId="07577616" wp14:editId="4159DA19">
+            <wp:extent cx="5730737" cy="2423370"/>
+            <wp:effectExtent l="0" t="0" r="3810" b="0"/>
+            <wp:docPr id="2008726401" name="Picture 1"/>
+            <wp:cNvGraphicFramePr>
+              <a:graphicFrameLocks xmlns:a="http://schemas.openxmlformats.org/drawingml/2006/main" noChangeAspect="1"/>
+            </wp:cNvGraphicFramePr>
+            <a:graphic xmlns:a="http://schemas.openxmlformats.org/drawingml/2006/main">
+              <a:graphicData uri="http://schemas.openxmlformats.org/drawingml/2006/picture">
+                <pic:pic xmlns:pic="http://schemas.openxmlformats.org/drawingml/2006/picture">
+                  <pic:nvPicPr>
+                    <pic:cNvPr id="2008726401" name=""/>
+                    <pic:cNvPicPr/>
+                  </pic:nvPicPr>
+                  <pic:blipFill>
+                    <a:blip r:embed="rId6"/>
+                    <a:stretch>
+                      <a:fillRect/>
+                    </a:stretch>
+                  </pic:blipFill>
+                  <pic:spPr>
+                    <a:xfrm>
+                      <a:off x="0" y="0"/>
+                      <a:ext cx="5730737" cy="2423370"/>
+                    </a:xfrm>
+                    <a:prstGeom prst="rect">
+                      <a:avLst/>
+                    </a:prstGeom>
+                  </pic:spPr>
+                </pic:pic>
+              </a:graphicData>
+            </a:graphic>
+          </wp:inline>
+        </w:drawing>
+      </w:r>
+    </w:p>
+    <w:p>
+      <w:r>
+        <w:drawing>
+          <wp:inline distT="0" distB="0" distL="0" distR="0" wp14:anchorId="5AF163C7" wp14:editId="798DB26A">
+            <wp:extent cx="3566469" cy="2400508"/>
+            <wp:effectExtent l="0" t="0" r="0" b="0"/>
+            <wp:docPr id="379096278" name="Picture 1"/>
+            <wp:cNvGraphicFramePr>
+              <a:graphicFrameLocks xmlns:a="http://schemas.openxmlformats.org/drawingml/2006/main" noChangeAspect="1"/>
+            </wp:cNvGraphicFramePr>
+            <a:graphic xmlns:a="http://schemas.openxmlformats.org/drawingml/2006/main">
+              <a:graphicData uri="http://schemas.openxmlformats.org/drawingml/2006/picture">
+                <pic:pic xmlns:pic="http://schemas.openxmlformats.org/drawingml/2006/picture">
+                  <pic:nvPicPr>
+                    <pic:cNvPr id="379096278" name=""/>
+                    <pic:cNvPicPr/>
+                  </pic:nvPicPr>
+                  <pic:blipFill>
+                    <a:blip r:embed="rId7"/>
+                    <a:stretch>
+                      <a:fillRect/>
+                    </a:stretch>
+                  </pic:blipFill>
+                  <pic:spPr>
+                    <a:xfrm>
+                      <a:off x="0" y="0"/>
+                      <a:ext cx="3566469" cy="2400508"/>
+                    </a:xfrm>
+                    <a:prstGeom prst="rect">
+                      <a:avLst/>
+                    </a:prstGeom>
+                  </pic:spPr>
+                </pic:pic>
+              </a:graphicData>
+            </a:graphic>
+          </wp:inline>
+        </w:drawing>
+      </w:r>
+    </w:p>
+    <w:p>
+      <w:r>
+        <w:t>Small k value will give you low bias and high variance, that is underfitting, larger k value will give you high bias and low variance.</w:t>
+      </w:r>
+    </w:p>
+    <w:p>
+      <w:pPr>
+        <w:rPr>
+          <w:b/>
+          <w:bCs/>
+        </w:rPr>
+      </w:pPr>
+      <w:r>
+        <w:rPr>
+          <w:b/>
+          <w:bCs/>
+        </w:rPr>
+        <w:t>EX:</w:t>
+      </w:r>
+    </w:p>
+    <w:p>
+      <w:r>
+        <w:t>In below the k value is 7 so we found 7 nearest data points from that we can see the class red has the maximum nearest neighbours, so here the bias is increased, variance decreased.</w:t>
+      </w:r>
+    </w:p>
+    <w:p>
+      <w:r>
+        <w:drawing>
+          <wp:inline distT="0" distB="0" distL="0" distR="0" wp14:anchorId="7A5FEAA8" wp14:editId="4CBA250B">
+            <wp:extent cx="3467400" cy="2248095"/>
+            <wp:effectExtent l="0" t="0" r="0" b="0"/>
+            <wp:docPr id="1265649993" name="Picture 1"/>
+            <wp:cNvGraphicFramePr>
+              <a:graphicFrameLocks xmlns:a="http://schemas.openxmlformats.org/drawingml/2006/main" noChangeAspect="1"/>
+            </wp:cNvGraphicFramePr>
+            <a:graphic xmlns:a="http://schemas.openxmlformats.org/drawingml/2006/main">
+              <a:graphicData uri="http://schemas.openxmlformats.org/drawingml/2006/picture">
+                <pic:pic xmlns:pic="http://schemas.openxmlformats.org/drawingml/2006/picture">
+                  <pic:nvPicPr>
+                    <pic:cNvPr id="1265649993" name=""/>
+                    <pic:cNvPicPr/>
+                  </pic:nvPicPr>
+                  <pic:blipFill>
+                    <a:blip r:embed="rId8"/>
+                    <a:stretch>
+                      <a:fillRect/>
+                    </a:stretch>
+                  </pic:blipFill>
+                  <pic:spPr>
+                    <a:xfrm>
+                      <a:off x="0" y="0"/>
+                      <a:ext cx="3467400" cy="2248095"/>
+                    </a:xfrm>
+                    <a:prstGeom prst="rect">
+                      <a:avLst/>
+                    </a:prstGeom>
+                  </pic:spPr>
+                </pic:pic>
+              </a:graphicData>
+            </a:graphic>
+          </wp:inline>
+        </w:drawing>
+      </w:r>
+    </w:p>
+    <w:p>
+      <w:pPr>
+        <w:rPr>
+          <w:b/>
+          <w:bCs/>
+        </w:rPr>
+      </w:pPr>
+      <w:r>
+        <w:rPr>
+          <w:b/>
+          <w:bCs/>
+        </w:rPr>
+        <w:t>KNN FOR REGRESSION</w:t>
+      </w:r>
+    </w:p>
+    <w:p>
+      <w:r>
+        <w:lastRenderedPageBreak/>
+        <w:t>In the example we find 2 nearest data points from two class and find the y value of two data points, from the y values we will calculate the average.</w:t>
+      </w:r>
+    </w:p>
+    <w:p>
+      <w:r>
+        <w:drawing>
+          <wp:inline distT="0" distB="0" distL="0" distR="0" wp14:anchorId="0A3355A8" wp14:editId="6E69B571">
+            <wp:extent cx="3398815" cy="2461473"/>
+            <wp:effectExtent l="0" t="0" r="0" b="0"/>
+            <wp:docPr id="1779188316" name="Picture 1"/>
+            <wp:cNvGraphicFramePr>
+              <a:graphicFrameLocks xmlns:a="http://schemas.openxmlformats.org/drawingml/2006/main" noChangeAspect="1"/>
+            </wp:cNvGraphicFramePr>
+            <a:graphic xmlns:a="http://schemas.openxmlformats.org/drawingml/2006/main">
+              <a:graphicData uri="http://schemas.openxmlformats.org/drawingml/2006/picture">
+                <pic:pic xmlns:pic="http://schemas.openxmlformats.org/drawingml/2006/picture">
+                  <pic:nvPicPr>
+                    <pic:cNvPr id="1779188316" name=""/>
+                    <pic:cNvPicPr/>
+                  </pic:nvPicPr>
+                  <pic:blipFill>
+                    <a:blip r:embed="rId9"/>
+                    <a:stretch>
+                      <a:fillRect/>
+                    </a:stretch>
+                  </pic:blipFill>
+                  <pic:spPr>
+                    <a:xfrm>
+                      <a:off x="0" y="0"/>
+                      <a:ext cx="3398815" cy="2461473"/>
+                    </a:xfrm>
+                    <a:prstGeom prst="rect">
+                      <a:avLst/>
+                    </a:prstGeom>
+                  </pic:spPr>
+                </pic:pic>
+              </a:graphicData>
+            </a:graphic>
+          </wp:inline>
+        </w:drawing>
+      </w:r>
+    </w:p>
+    <w:p>
+      <w:pPr>
+        <w:rPr>
+          <w:b/>
+          <w:bCs/>
+        </w:rPr>
+      </w:pPr>
+      <w:r>
+        <w:rPr>
+          <w:b/>
+          <w:bCs/>
+        </w:rPr>
+        <w:t>ANOTHER FROMULA FOR KNN CLASSIFICATION</w:t>
+      </w:r>
+    </w:p>
+    <w:p>
+      <w:r>
+        <w:t>Euclidean distance</w:t>
+      </w:r>
+    </w:p>
+    <w:p>
+      <w:pPr>
+        <w:rPr>
+          <w:b/>
+          <w:bCs/>
+        </w:rPr>
+      </w:pPr>
+      <w:r>
+        <w:rPr>
+          <w:b/>
+          <w:bCs/>
+        </w:rPr>
+        <w:drawing>
+          <wp:inline distT="0" distB="0" distL="0" distR="0" wp14:anchorId="72470EB8" wp14:editId="2B0CA2E7">
+            <wp:extent cx="2720576" cy="815411"/>
+            <wp:effectExtent l="0" t="0" r="3810" b="3810"/>
+            <wp:docPr id="804052314" name="Picture 1"/>
+            <wp:cNvGraphicFramePr>
+              <a:graphicFrameLocks xmlns:a="http://schemas.openxmlformats.org/drawingml/2006/main" noChangeAspect="1"/>
+            </wp:cNvGraphicFramePr>
+            <a:graphic xmlns:a="http://schemas.openxmlformats.org/drawingml/2006/main">
+              <a:graphicData uri="http://schemas.openxmlformats.org/drawingml/2006/picture">
+                <pic:pic xmlns:pic="http://schemas.openxmlformats.org/drawingml/2006/picture">
+                  <pic:nvPicPr>
+                    <pic:cNvPr id="804052314" name=""/>
+                    <pic:cNvPicPr/>
+                  </pic:nvPicPr>
+                  <pic:blipFill>
+                    <a:blip r:embed="rId10"/>
+                    <a:stretch>
+                      <a:fillRect/>
+                    </a:stretch>
+                  </pic:blipFill>
+                  <pic:spPr>
+                    <a:xfrm>
+                      <a:off x="0" y="0"/>
+                      <a:ext cx="2720576" cy="815411"/>
+                    </a:xfrm>
+                    <a:prstGeom prst="rect">
+                      <a:avLst/>
+                    </a:prstGeom>
+                  </pic:spPr>
+                </pic:pic>
+              </a:graphicData>
+            </a:graphic>
+          </wp:inline>
+        </w:drawing>
+      </w:r>
+    </w:p>
+    <w:p>
+      <w:r>
+        <w:t>From the above formula we will calculate the distance from new data point x=4, y=5 in below case.</w:t>
+      </w:r>
+    </w:p>
+    <w:p>
+      <w:r>
+        <w:drawing>
+          <wp:inline distT="0" distB="0" distL="0" distR="0" wp14:anchorId="584D8C86" wp14:editId="3214E100">
+            <wp:extent cx="3596952" cy="2370025"/>
+            <wp:effectExtent l="0" t="0" r="3810" b="0"/>
+            <wp:docPr id="1586784661" name="Picture 1"/>
+            <wp:cNvGraphicFramePr>
+              <a:graphicFrameLocks xmlns:a="http://schemas.openxmlformats.org/drawingml/2006/main" noChangeAspect="1"/>
+            </wp:cNvGraphicFramePr>
+            <a:graphic xmlns:a="http://schemas.openxmlformats.org/drawingml/2006/main">
+              <a:graphicData uri="http://schemas.openxmlformats.org/drawingml/2006/picture">
+                <pic:pic xmlns:pic="http://schemas.openxmlformats.org/drawingml/2006/picture">
+                  <pic:nvPicPr>
+                    <pic:cNvPr id="1586784661" name=""/>
+                    <pic:cNvPicPr/>
+                  </pic:nvPicPr>
+                  <pic:blipFill>
+                    <a:blip r:embed="rId11"/>
+                    <a:stretch>
+                      <a:fillRect/>
+                    </a:stretch>
+                  </pic:blipFill>
+                  <pic:spPr>
+                    <a:xfrm>
+                      <a:off x="0" y="0"/>
+                      <a:ext cx="3596952" cy="2370025"/>
+                    </a:xfrm>
+                    <a:prstGeom prst="rect">
+                      <a:avLst/>
+                    </a:prstGeom>
+                  </pic:spPr>
+                </pic:pic>
+              </a:graphicData>
+            </a:graphic>
+          </wp:inline>
+        </w:drawing>
+      </w:r>
+    </w:p>
+    <w:p>
+      <w:proofErr w:type="gramStart"/>
+      <w:r>
+        <w:t>So</w:t>
+      </w:r>
+      <w:proofErr w:type="gramEnd"/>
+      <w:r>
+        <w:t xml:space="preserve"> the class for new data point is A.</w:t>
+      </w:r>
+    </w:p>
+    <w:p>
+      <w:pPr>
+        <w:rPr>
+          <w:b/>
+          <w:bCs/>
+        </w:rPr>
+      </w:pPr>
+      <w:r>
+        <w:rPr>
+          <w:b/>
+          <w:bCs/>
+        </w:rPr>
+        <w:t>EXAMPLE FOR KNN REGRESSION</w:t>
+      </w:r>
+    </w:p>
+    <w:p>
+      <w:r>
+        <w:t>For regression we commonly predict the y value from the with the input(x) value.</w:t>
+      </w:r>
+      <w:r>
+        <w:t xml:space="preserve"> Below the x is 3</w:t>
+      </w:r>
+    </w:p>
+    <w:p>
+      <w:r>
+        <w:lastRenderedPageBreak/>
+        <w:drawing>
+          <wp:inline distT="0" distB="0" distL="0" distR="0" wp14:anchorId="55B31E38" wp14:editId="539B27EE">
+            <wp:extent cx="5296359" cy="2514818"/>
+            <wp:effectExtent l="0" t="0" r="0" b="0"/>
+            <wp:docPr id="990334713" name="Picture 1"/>
+            <wp:cNvGraphicFramePr>
+              <a:graphicFrameLocks xmlns:a="http://schemas.openxmlformats.org/drawingml/2006/main" noChangeAspect="1"/>
+            </wp:cNvGraphicFramePr>
+            <a:graphic xmlns:a="http://schemas.openxmlformats.org/drawingml/2006/main">
+              <a:graphicData uri="http://schemas.openxmlformats.org/drawingml/2006/picture">
+                <pic:pic xmlns:pic="http://schemas.openxmlformats.org/drawingml/2006/picture">
+                  <pic:nvPicPr>
+                    <pic:cNvPr id="990334713" name=""/>
+                    <pic:cNvPicPr/>
+                  </pic:nvPicPr>
+                  <pic:blipFill>
+                    <a:blip r:embed="rId12"/>
+                    <a:stretch>
+                      <a:fillRect/>
+                    </a:stretch>
+                  </pic:blipFill>
+                  <pic:spPr>
+                    <a:xfrm>
+                      <a:off x="0" y="0"/>
+                      <a:ext cx="5296359" cy="2514818"/>
+                    </a:xfrm>
+                    <a:prstGeom prst="rect">
+                      <a:avLst/>
+                    </a:prstGeom>
+                  </pic:spPr>
+                </pic:pic>
+              </a:graphicData>
+            </a:graphic>
+          </wp:inline>
+        </w:drawing>
+      </w:r>
+    </w:p>
+    <w:p>
+      <w:r>
+        <w:t>In above we found 2 nearest data points that is x=2 (3-2=1) and x=4 (3-4=1) than took the y values for those corresponding x value that are 3,5 from that we found average.</w:t>
+      </w:r>
+    </w:p>
     <w:sectPr>
       <w:pgSz w:w="11906" w:h="16838"/>
       <w:pgMar w:top="1440" w:right="1440" w:bottom="1440" w:left="1440" w:header="708" w:footer="708" w:gutter="0"/>
@@ -94,7 +499,7 @@
 </file>
 
 <file path=word/styles.xml><?xml version="1.0" encoding="utf-8"?>
-<w:styles xmlns:mc="http://schemas.openxmlformats.org/markup-compatibility/2006" xmlns:r="http://schemas.openxmlformats.org/officeDocument/2006/relationships" xmlns:w="http://schemas.openxmlformats.org/wordprocessingml/2006/main" xmlns:w14="http://schemas.microsoft.com/office/word/2010/wordml" xmlns:w15="http://schemas.microsoft.com/office/word/2012/wordml" xmlns:w16cex="http://schemas.microsoft.com/office/word/2018/wordml/cex" xmlns:w16cid="http://schemas.microsoft.com/office/word/2016/wordml/cid" xmlns:w16="http://schemas.microsoft.com/office/word/2018/wordml" xmlns:w16du="http://schemas.microsoft.com/office/word/2023/wordml/word16du" xmlns:w16sdtdh="http://schemas.microsoft.com/office/word/2020/wordml/sdtdatahash" xmlns:w16se="http://schemas.microsoft.com/office/word/2015/wordml/symex" mc:Ignorable="w14 w15 w16se w16cid w16 w16cex w16sdtdh w16du">
+<w:styles xmlns:mc="http://schemas.openxmlformats.org/markup-compatibility/2006" xmlns:r="http://schemas.openxmlformats.org/officeDocument/2006/relationships" xmlns:w="http://schemas.openxmlformats.org/wordprocessingml/2006/main" xmlns:w14="http://schemas.microsoft.com/office/word/2010/wordml" xmlns:w15="http://schemas.microsoft.com/office/word/2012/wordml" xmlns:w16cex="http://schemas.microsoft.com/office/word/2018/wordml/cex" xmlns:w16cid="http://schemas.microsoft.com/office/word/2016/wordml/cid" xmlns:w16="http://schemas.microsoft.com/office/word/2018/wordml" xmlns:w16du="http://schemas.microsoft.com/office/word/2023/wordml/word16du" xmlns:w16sdtdh="http://schemas.microsoft.com/office/word/2020/wordml/sdtdatahash" xmlns:w16sdtfl="http://schemas.microsoft.com/office/word/2024/wordml/sdtformatlock" xmlns:w16se="http://schemas.microsoft.com/office/word/2015/wordml/symex" mc:Ignorable="w14 w15 w16se w16cid w16 w16cex w16sdtdh w16sdtfl w16du">
   <w:docDefaults>
     <w:rPrDefault>
       <w:rPr>
@@ -497,7 +902,6 @@
   <w:style w:type="character" w:default="1" w:styleId="DefaultParagraphFont">
     <w:name w:val="Default Paragraph Font"/>
     <w:uiPriority w:val="1"/>
-    <w:semiHidden/>
     <w:unhideWhenUsed/>
   </w:style>
   <w:style w:type="table" w:default="1" w:styleId="TableNormal">

</xml_diff>